<commit_message>
Fix: Remove empty paragraphs from DOCX template, remove email sending on Flutter completion, improve inspection completion handling
</commit_message>
<xml_diff>
--- a/templates/template.docx
+++ b/templates/template.docx
@@ -1617,10 +1617,10 @@
         <w:t>_base}}</w:t>
       </w:r>
     </w:p>
-    <w:p>
+    <w:p w14:noSpellErr="1">
       <w:r>
         <w:drawing>
-          <wp:inline wp14:editId="328DFA86" wp14:anchorId="472FDBE9">
+          <wp:inline wp14:editId="0FFCEEE4" wp14:anchorId="472FDBE9">
             <wp:extent cx="2143125" cy="2143125"/>
             <wp:effectExtent l="0" t="0" r="9525" b="9525"/>
             <wp:docPr id="829094576" name="Picture 1" descr="{{image}}"/>
@@ -1656,7 +1656,6 @@
         </w:drawing>
       </w:r>
     </w:p>
-    <w:p/>
     <w:p>
       <w:r>
         <w:t>{{/</w:t>

</xml_diff>